<commit_message>
Regenerate manuals with simplified password examples
</commit_message>
<xml_diff>
--- a/Дастури_истифодабарии_Портали_Маориф_барои_Завуч.docx
+++ b/Дастури_истифодабарии_Портали_Маориф_барои_Завуч.docx
@@ -222,7 +222,7 @@
                 <w:b w:val="0"/>
                 <w:sz w:val="22"/>
               </w:rPr>
-              <w:t>Director_M20_2026@</w:t>
+              <w:t>Director_20_2026@</w:t>
             </w:r>
           </w:p>
         </w:tc>
@@ -269,7 +269,7 @@
                 <w:b w:val="0"/>
                 <w:sz w:val="22"/>
               </w:rPr>
-              <w:t>Zavuch_M20@2026</w:t>
+              <w:t>Zavuch_20_2026@</w:t>
             </w:r>
           </w:p>
         </w:tc>

</xml_diff>

<commit_message>
Remove M from teacher usernames and passwords and update alignment script
</commit_message>
<xml_diff>
--- a/Дастури_истифодабарии_Портали_Маориф_барои_Завуч.docx
+++ b/Дастури_истифодабарии_Портали_Маориф_барои_Завуч.docx
@@ -301,7 +301,7 @@
                 <w:b w:val="0"/>
                 <w:sz w:val="22"/>
               </w:rPr>
-              <w:t>teacher_M20_1</w:t>
+              <w:t>teacher_20_1</w:t>
             </w:r>
           </w:p>
         </w:tc>
@@ -316,7 +316,7 @@
                 <w:b w:val="0"/>
                 <w:sz w:val="22"/>
               </w:rPr>
-              <w:t>Teacher_M20_1@2026</w:t>
+              <w:t>Teacher_20_1@2026</w:t>
             </w:r>
           </w:p>
         </w:tc>
@@ -1745,7 +1745,7 @@
           <w:b w:val="0"/>
           <w:sz w:val="22"/>
         </w:rPr>
-        <w:t>Омӯзгор бо логини худ (teacher_M[рақами мактаб]_[counter]) ворид мешавад, масалан teacher_M20_1.</w:t>
+        <w:t>Омӯзгор бо логини худ (teacher_[рақами мактаб]_[counter]) ворид мешавад, масалан teacher_20_1.</w:t>
       </w:r>
     </w:p>
     <w:p>

</xml_diff>